<commit_message>
book card et rating
</commit_message>
<xml_diff>
--- a/front.docx
+++ b/front.docx
@@ -57,25 +57,7 @@
           <w:szCs w:val="24"/>
           <w:lang w:val="en-US"/>
         </w:rPr>
-        <w:t xml:space="preserve">Copy le </w:t>
-      </w:r>
-      <w:proofErr w:type="spellStart"/>
-      <w:r>
-        <w:rPr>
-          <w:sz w:val="24"/>
-          <w:szCs w:val="24"/>
-          <w:lang w:val="en-US"/>
-        </w:rPr>
-        <w:t>npm</w:t>
-      </w:r>
-      <w:proofErr w:type="spellEnd"/>
-      <w:r>
-        <w:rPr>
-          <w:sz w:val="24"/>
-          <w:szCs w:val="24"/>
-          <w:lang w:val="en-US"/>
-        </w:rPr>
-        <w:t xml:space="preserve"> install from site official of bootstrap </w:t>
+        <w:t xml:space="preserve">Copy le npm install from site official of bootstrap </w:t>
       </w:r>
     </w:p>
     <w:p>
@@ -95,57 +77,7 @@
           <w:sz w:val="24"/>
           <w:szCs w:val="24"/>
         </w:rPr>
-        <w:t xml:space="preserve">Dans </w:t>
-      </w:r>
-      <w:proofErr w:type="spellStart"/>
-      <w:proofErr w:type="gramStart"/>
-      <w:r>
-        <w:rPr>
-          <w:sz w:val="24"/>
-          <w:szCs w:val="24"/>
-        </w:rPr>
-        <w:t>package.json</w:t>
-      </w:r>
-      <w:proofErr w:type="spellEnd"/>
-      <w:proofErr w:type="gramEnd"/>
-      <w:r>
-        <w:rPr>
-          <w:sz w:val="24"/>
-          <w:szCs w:val="24"/>
-        </w:rPr>
-        <w:t xml:space="preserve"> </w:t>
-      </w:r>
-      <w:proofErr w:type="spellStart"/>
-      <w:r>
-        <w:rPr>
-          <w:sz w:val="24"/>
-          <w:szCs w:val="24"/>
-        </w:rPr>
-        <w:t>verifier</w:t>
-      </w:r>
-      <w:proofErr w:type="spellEnd"/>
-      <w:r>
-        <w:rPr>
-          <w:sz w:val="24"/>
-          <w:szCs w:val="24"/>
-        </w:rPr>
-        <w:t xml:space="preserve"> si le </w:t>
-      </w:r>
-      <w:proofErr w:type="spellStart"/>
-      <w:r>
-        <w:rPr>
-          <w:sz w:val="24"/>
-          <w:szCs w:val="24"/>
-        </w:rPr>
-        <w:t>depandance</w:t>
-      </w:r>
-      <w:proofErr w:type="spellEnd"/>
-      <w:r>
-        <w:rPr>
-          <w:sz w:val="24"/>
-          <w:szCs w:val="24"/>
-        </w:rPr>
-        <w:t xml:space="preserve"> correctement ajouter </w:t>
+        <w:t xml:space="preserve">Dans package.json verifier si le depandance correctement ajouter </w:t>
       </w:r>
     </w:p>
     <w:p>
@@ -165,35 +97,8 @@
           <w:sz w:val="24"/>
           <w:szCs w:val="24"/>
         </w:rPr>
-        <w:t xml:space="preserve">Importer </w:t>
-      </w:r>
-      <w:proofErr w:type="spellStart"/>
-      <w:r>
-        <w:rPr>
-          <w:sz w:val="24"/>
-          <w:szCs w:val="24"/>
-        </w:rPr>
-        <w:t>bootsrap</w:t>
-      </w:r>
-      <w:proofErr w:type="spellEnd"/>
-      <w:r>
-        <w:rPr>
-          <w:sz w:val="24"/>
-          <w:szCs w:val="24"/>
-        </w:rPr>
-        <w:t xml:space="preserve"> dans le fichier </w:t>
-      </w:r>
-      <w:proofErr w:type="spellStart"/>
-      <w:proofErr w:type="gramStart"/>
-      <w:r>
-        <w:rPr>
-          <w:sz w:val="24"/>
-          <w:szCs w:val="24"/>
-        </w:rPr>
-        <w:t>styles.scss</w:t>
-      </w:r>
-      <w:proofErr w:type="spellEnd"/>
-      <w:proofErr w:type="gramEnd"/>
+        <w:t>Importer bootsrap dans le fichier styles.scss</w:t>
+      </w:r>
     </w:p>
     <w:p>
       <w:pPr>
@@ -223,51 +128,7 @@
           <w:szCs w:val="24"/>
           <w:lang w:val="en-US"/>
         </w:rPr>
-        <w:t>@import "bootstrap/</w:t>
-      </w:r>
-      <w:proofErr w:type="spellStart"/>
-      <w:r>
-        <w:rPr>
-          <w:b/>
-          <w:bCs/>
-          <w:sz w:val="24"/>
-          <w:szCs w:val="24"/>
-          <w:lang w:val="en-US"/>
-        </w:rPr>
-        <w:t>dist</w:t>
-      </w:r>
-      <w:proofErr w:type="spellEnd"/>
-      <w:r>
-        <w:rPr>
-          <w:b/>
-          <w:bCs/>
-          <w:sz w:val="24"/>
-          <w:szCs w:val="24"/>
-          <w:lang w:val="en-US"/>
-        </w:rPr>
-        <w:t>/</w:t>
-      </w:r>
-      <w:proofErr w:type="spellStart"/>
-      <w:r>
-        <w:rPr>
-          <w:b/>
-          <w:bCs/>
-          <w:sz w:val="24"/>
-          <w:szCs w:val="24"/>
-          <w:lang w:val="en-US"/>
-        </w:rPr>
-        <w:t>css</w:t>
-      </w:r>
-      <w:proofErr w:type="spellEnd"/>
-      <w:r>
-        <w:rPr>
-          <w:b/>
-          <w:bCs/>
-          <w:sz w:val="24"/>
-          <w:szCs w:val="24"/>
-          <w:lang w:val="en-US"/>
-        </w:rPr>
-        <w:t>/bootstrap.min.css";</w:t>
+        <w:t>@import "bootstrap/dist/css/bootstrap.min.css";</w:t>
       </w:r>
     </w:p>
     <w:p>
@@ -283,7 +144,6 @@
           <w:lang w:val="en-US"/>
         </w:rPr>
       </w:pPr>
-      <w:proofErr w:type="spellStart"/>
       <w:r>
         <w:rPr>
           <w:sz w:val="24"/>
@@ -292,26 +152,14 @@
         </w:rPr>
         <w:t>Ajouter</w:t>
       </w:r>
-      <w:proofErr w:type="spellEnd"/>
-      <w:r>
-        <w:rPr>
-          <w:sz w:val="24"/>
-          <w:szCs w:val="24"/>
-          <w:lang w:val="en-US"/>
-        </w:rPr>
-        <w:t xml:space="preserve"> et </w:t>
-      </w:r>
-      <w:proofErr w:type="spellStart"/>
-      <w:proofErr w:type="gramStart"/>
-      <w:r>
-        <w:rPr>
-          <w:sz w:val="24"/>
-          <w:szCs w:val="24"/>
-          <w:lang w:val="en-US"/>
-        </w:rPr>
-        <w:t>importé</w:t>
-      </w:r>
-      <w:proofErr w:type="spellEnd"/>
+      <w:r>
+        <w:rPr>
+          <w:sz w:val="24"/>
+          <w:szCs w:val="24"/>
+          <w:lang w:val="en-US"/>
+        </w:rPr>
+        <w:t xml:space="preserve"> et importé </w:t>
+      </w:r>
       <w:r>
         <w:rPr>
           <w:sz w:val="24"/>
@@ -326,26 +174,7 @@
           <w:szCs w:val="24"/>
           <w:lang w:val="en-US"/>
         </w:rPr>
-        <w:t xml:space="preserve"> </w:t>
-      </w:r>
-      <w:proofErr w:type="spellStart"/>
-      <w:r>
-        <w:rPr>
-          <w:sz w:val="24"/>
-          <w:szCs w:val="24"/>
-          <w:lang w:val="en-US"/>
-        </w:rPr>
-        <w:t>fontawsone</w:t>
-      </w:r>
-      <w:proofErr w:type="spellEnd"/>
-      <w:proofErr w:type="gramEnd"/>
-      <w:r>
-        <w:rPr>
-          <w:sz w:val="24"/>
-          <w:szCs w:val="24"/>
-          <w:lang w:val="en-US"/>
-        </w:rPr>
-        <w:t xml:space="preserve"> </w:t>
+        <w:t xml:space="preserve">fontawsone </w:t>
       </w:r>
     </w:p>
     <w:p>
@@ -359,27 +188,15 @@
           <w:lang w:val="en-US"/>
         </w:rPr>
       </w:pPr>
-      <w:proofErr w:type="spellStart"/>
-      <w:r>
-        <w:rPr>
-          <w:b/>
-          <w:bCs/>
-          <w:sz w:val="24"/>
-          <w:szCs w:val="24"/>
-          <w:lang w:val="en-US"/>
-        </w:rPr>
-        <w:t>npm</w:t>
-      </w:r>
-      <w:proofErr w:type="spellEnd"/>
-      <w:r>
-        <w:rPr>
-          <w:b/>
-          <w:bCs/>
-          <w:sz w:val="24"/>
-          <w:szCs w:val="24"/>
-          <w:lang w:val="en-US"/>
-        </w:rPr>
-        <w:t xml:space="preserve"> install @fortawesome/fontawesome-free</w:t>
+      <w:r>
+        <w:rPr>
+          <w:b/>
+          <w:bCs/>
+          <w:sz w:val="24"/>
+          <w:szCs w:val="24"/>
+          <w:lang w:val="en-US"/>
+        </w:rPr>
+        <w:t>npm install @fortawesome/fontawesome-free</w:t>
       </w:r>
     </w:p>
     <w:p>
@@ -419,73 +236,7 @@
           <w:szCs w:val="24"/>
           <w:lang w:val="en-US"/>
         </w:rPr>
-        <w:t>@import "@</w:t>
-      </w:r>
-      <w:proofErr w:type="spellStart"/>
-      <w:r>
-        <w:rPr>
-          <w:b/>
-          <w:bCs/>
-          <w:sz w:val="24"/>
-          <w:szCs w:val="24"/>
-          <w:lang w:val="en-US"/>
-        </w:rPr>
-        <w:t>fortawesome</w:t>
-      </w:r>
-      <w:proofErr w:type="spellEnd"/>
-      <w:r>
-        <w:rPr>
-          <w:b/>
-          <w:bCs/>
-          <w:sz w:val="24"/>
-          <w:szCs w:val="24"/>
-          <w:lang w:val="en-US"/>
-        </w:rPr>
-        <w:t>/</w:t>
-      </w:r>
-      <w:proofErr w:type="spellStart"/>
-      <w:r>
-        <w:rPr>
-          <w:b/>
-          <w:bCs/>
-          <w:sz w:val="24"/>
-          <w:szCs w:val="24"/>
-          <w:lang w:val="en-US"/>
-        </w:rPr>
-        <w:t>fontawesome</w:t>
-      </w:r>
-      <w:proofErr w:type="spellEnd"/>
-      <w:r>
-        <w:rPr>
-          <w:b/>
-          <w:bCs/>
-          <w:sz w:val="24"/>
-          <w:szCs w:val="24"/>
-          <w:lang w:val="en-US"/>
-        </w:rPr>
-        <w:t>-free/</w:t>
-      </w:r>
-      <w:proofErr w:type="spellStart"/>
-      <w:r>
-        <w:rPr>
-          <w:b/>
-          <w:bCs/>
-          <w:sz w:val="24"/>
-          <w:szCs w:val="24"/>
-          <w:lang w:val="en-US"/>
-        </w:rPr>
-        <w:t>css</w:t>
-      </w:r>
-      <w:proofErr w:type="spellEnd"/>
-      <w:r>
-        <w:rPr>
-          <w:b/>
-          <w:bCs/>
-          <w:sz w:val="24"/>
-          <w:szCs w:val="24"/>
-          <w:lang w:val="en-US"/>
-        </w:rPr>
-        <w:t>/all.min.css";</w:t>
+        <w:t>@import "@fortawesome/fontawesome-free/css/all.min.css";</w:t>
       </w:r>
     </w:p>
     <w:p>
@@ -521,29 +272,7 @@
           <w:szCs w:val="24"/>
           <w:lang w:val="en-US"/>
         </w:rPr>
-        <w:t xml:space="preserve">Configure </w:t>
-      </w:r>
-      <w:proofErr w:type="spellStart"/>
-      <w:r>
-        <w:rPr>
-          <w:b/>
-          <w:bCs/>
-          <w:sz w:val="24"/>
-          <w:szCs w:val="24"/>
-          <w:lang w:val="en-US"/>
-        </w:rPr>
-        <w:t>OpenApi</w:t>
-      </w:r>
-      <w:proofErr w:type="spellEnd"/>
-      <w:r>
-        <w:rPr>
-          <w:b/>
-          <w:bCs/>
-          <w:sz w:val="24"/>
-          <w:szCs w:val="24"/>
-          <w:lang w:val="en-US"/>
-        </w:rPr>
-        <w:t xml:space="preserve"> </w:t>
+        <w:t xml:space="preserve">Configure OpenApi </w:t>
       </w:r>
     </w:p>
     <w:p>
@@ -561,41 +290,13 @@
           <w:lang w:val="en-US"/>
         </w:rPr>
       </w:pPr>
-      <w:proofErr w:type="spellStart"/>
-      <w:r>
-        <w:rPr>
-          <w:sz w:val="24"/>
-          <w:szCs w:val="24"/>
-          <w:lang w:val="en-US"/>
-        </w:rPr>
-        <w:t>Ouvrire</w:t>
-      </w:r>
-      <w:proofErr w:type="spellEnd"/>
-      <w:r>
-        <w:rPr>
-          <w:sz w:val="24"/>
-          <w:szCs w:val="24"/>
-          <w:lang w:val="en-US"/>
-        </w:rPr>
-        <w:t xml:space="preserve"> le </w:t>
-      </w:r>
-      <w:proofErr w:type="spellStart"/>
-      <w:r>
-        <w:rPr>
-          <w:sz w:val="24"/>
-          <w:szCs w:val="24"/>
-          <w:lang w:val="en-US"/>
-        </w:rPr>
-        <w:t>ui</w:t>
-      </w:r>
-      <w:proofErr w:type="spellEnd"/>
-      <w:r>
-        <w:rPr>
-          <w:sz w:val="24"/>
-          <w:szCs w:val="24"/>
-          <w:lang w:val="en-US"/>
-        </w:rPr>
-        <w:t xml:space="preserve"> de swager  </w:t>
+      <w:r>
+        <w:rPr>
+          <w:sz w:val="24"/>
+          <w:szCs w:val="24"/>
+          <w:lang w:val="en-US"/>
+        </w:rPr>
+        <w:t xml:space="preserve">Ouvrire le ui de swager  </w:t>
       </w:r>
     </w:p>
     <w:p>
@@ -645,25 +346,7 @@
           <w:szCs w:val="24"/>
           <w:lang w:val="en-US"/>
         </w:rPr>
-        <w:t xml:space="preserve">Copier le code des </w:t>
-      </w:r>
-      <w:proofErr w:type="spellStart"/>
-      <w:r>
-        <w:rPr>
-          <w:sz w:val="24"/>
-          <w:szCs w:val="24"/>
-          <w:lang w:val="en-US"/>
-        </w:rPr>
-        <w:t>api</w:t>
-      </w:r>
-      <w:proofErr w:type="spellEnd"/>
-      <w:r>
-        <w:rPr>
-          <w:sz w:val="24"/>
-          <w:szCs w:val="24"/>
-          <w:lang w:val="en-US"/>
-        </w:rPr>
-        <w:t xml:space="preserve"> </w:t>
+        <w:t xml:space="preserve">Copier le code des api </w:t>
       </w:r>
     </w:p>
     <w:p>
@@ -685,43 +368,16 @@
           <w:sz w:val="24"/>
           <w:szCs w:val="24"/>
         </w:rPr>
-        <w:t xml:space="preserve">Dans src </w:t>
-      </w:r>
-      <w:proofErr w:type="spellStart"/>
-      <w:r>
-        <w:rPr>
-          <w:sz w:val="24"/>
-          <w:szCs w:val="24"/>
-        </w:rPr>
-        <w:t>crrer</w:t>
-      </w:r>
-      <w:proofErr w:type="spellEnd"/>
-      <w:r>
-        <w:rPr>
-          <w:sz w:val="24"/>
-          <w:szCs w:val="24"/>
-        </w:rPr>
-        <w:t xml:space="preserve"> un dossier </w:t>
-      </w:r>
-      <w:proofErr w:type="spellStart"/>
-      <w:r>
-        <w:rPr>
-          <w:b/>
-          <w:bCs/>
-          <w:sz w:val="24"/>
-          <w:szCs w:val="24"/>
-        </w:rPr>
-        <w:t>openApi</w:t>
-      </w:r>
-      <w:proofErr w:type="spellEnd"/>
-      <w:r>
-        <w:rPr>
-          <w:b/>
-          <w:bCs/>
-          <w:sz w:val="24"/>
-          <w:szCs w:val="24"/>
-        </w:rPr>
-        <w:t xml:space="preserve"> </w:t>
+        <w:t xml:space="preserve">Dans src crrer un dossier </w:t>
+      </w:r>
+      <w:r>
+        <w:rPr>
+          <w:b/>
+          <w:bCs/>
+          <w:sz w:val="24"/>
+          <w:szCs w:val="24"/>
+        </w:rPr>
+        <w:t xml:space="preserve">openApi </w:t>
       </w:r>
       <w:r>
         <w:rPr>
@@ -735,63 +391,16 @@
           <w:sz w:val="24"/>
           <w:szCs w:val="24"/>
         </w:rPr>
-        <w:t xml:space="preserve"> dans ce dossier </w:t>
-      </w:r>
-      <w:proofErr w:type="spellStart"/>
-      <w:r>
-        <w:rPr>
-          <w:sz w:val="24"/>
-          <w:szCs w:val="24"/>
-        </w:rPr>
-        <w:t>creerr</w:t>
-      </w:r>
-      <w:proofErr w:type="spellEnd"/>
-      <w:r>
-        <w:rPr>
-          <w:sz w:val="24"/>
-          <w:szCs w:val="24"/>
-        </w:rPr>
-        <w:t xml:space="preserve"> une ficher </w:t>
-      </w:r>
-      <w:proofErr w:type="spellStart"/>
-      <w:r>
-        <w:rPr>
-          <w:b/>
-          <w:bCs/>
-          <w:sz w:val="24"/>
-          <w:szCs w:val="24"/>
-        </w:rPr>
-        <w:t>json</w:t>
-      </w:r>
-      <w:proofErr w:type="spellEnd"/>
-      <w:r>
-        <w:rPr>
-          <w:b/>
-          <w:bCs/>
-          <w:sz w:val="24"/>
-          <w:szCs w:val="24"/>
-        </w:rPr>
-        <w:t xml:space="preserve"> « </w:t>
-      </w:r>
-      <w:proofErr w:type="spellStart"/>
-      <w:r>
-        <w:rPr>
-          <w:b/>
-          <w:bCs/>
-          <w:sz w:val="24"/>
-          <w:szCs w:val="24"/>
-        </w:rPr>
-        <w:t>openApi.json</w:t>
-      </w:r>
-      <w:proofErr w:type="spellEnd"/>
-      <w:r>
-        <w:rPr>
-          <w:b/>
-          <w:bCs/>
-          <w:sz w:val="24"/>
-          <w:szCs w:val="24"/>
-        </w:rPr>
-        <w:t xml:space="preserve"> » </w:t>
+        <w:t xml:space="preserve"> dans ce dossier creerr une ficher </w:t>
+      </w:r>
+      <w:r>
+        <w:rPr>
+          <w:b/>
+          <w:bCs/>
+          <w:sz w:val="24"/>
+          <w:szCs w:val="24"/>
+        </w:rPr>
+        <w:t xml:space="preserve">json « openApi.json » </w:t>
       </w:r>
       <w:r>
         <w:rPr>
@@ -823,58 +432,19 @@
       </w:r>
       <w:r>
         <w:rPr>
-          <w:sz w:val="24"/>
-          <w:szCs w:val="24"/>
-        </w:rPr>
-        <w:t xml:space="preserve"> </w:t>
-      </w:r>
-      <w:proofErr w:type="gramStart"/>
-      <w:r>
-        <w:rPr>
-          <w:sz w:val="24"/>
-          <w:szCs w:val="24"/>
-        </w:rPr>
-        <w:t xml:space="preserve">( </w:t>
-      </w:r>
-      <w:proofErr w:type="spellStart"/>
-      <w:r>
-        <w:rPr>
-          <w:sz w:val="24"/>
-          <w:szCs w:val="24"/>
-        </w:rPr>
-        <w:t>ctrl</w:t>
-      </w:r>
-      <w:proofErr w:type="gramEnd"/>
-      <w:r>
-        <w:rPr>
-          <w:sz w:val="24"/>
-          <w:szCs w:val="24"/>
-        </w:rPr>
-        <w:t>+alt+l</w:t>
-      </w:r>
-      <w:proofErr w:type="spellEnd"/>
-      <w:r>
-        <w:rPr>
-          <w:sz w:val="24"/>
-          <w:szCs w:val="24"/>
-        </w:rPr>
-        <w:t xml:space="preserve"> pour formatter </w:t>
-      </w:r>
-      <w:proofErr w:type="gramStart"/>
-      <w:r>
-        <w:rPr>
-          <w:sz w:val="24"/>
-          <w:szCs w:val="24"/>
-        </w:rPr>
-        <w:t>code )</w:t>
-      </w:r>
-      <w:proofErr w:type="gramEnd"/>
-      <w:r>
-        <w:rPr>
-          <w:sz w:val="24"/>
-          <w:szCs w:val="24"/>
-        </w:rPr>
-        <w:t xml:space="preserve">  </w:t>
+          <w:b/>
+          <w:bCs/>
+          <w:sz w:val="24"/>
+          <w:szCs w:val="24"/>
+        </w:rPr>
+        <w:t xml:space="preserve"> ( ctrl+alt+l</w:t>
+      </w:r>
+      <w:r>
+        <w:rPr>
+          <w:sz w:val="24"/>
+          <w:szCs w:val="24"/>
+        </w:rPr>
+        <w:t xml:space="preserve"> pour formatter code )  </w:t>
       </w:r>
     </w:p>
     <w:p>
@@ -908,87 +478,17 @@
           <w:szCs w:val="24"/>
           <w:lang w:val="en-US"/>
         </w:rPr>
-        <w:t xml:space="preserve">Installer </w:t>
-      </w:r>
-      <w:proofErr w:type="spellStart"/>
-      <w:r>
-        <w:rPr>
-          <w:sz w:val="24"/>
-          <w:szCs w:val="24"/>
-          <w:lang w:val="en-US"/>
-        </w:rPr>
-        <w:t>une</w:t>
-      </w:r>
-      <w:proofErr w:type="spellEnd"/>
-      <w:r>
-        <w:rPr>
-          <w:sz w:val="24"/>
-          <w:szCs w:val="24"/>
-          <w:lang w:val="en-US"/>
-        </w:rPr>
-        <w:t xml:space="preserve"> dependances open-</w:t>
-      </w:r>
-      <w:proofErr w:type="spellStart"/>
-      <w:r>
-        <w:rPr>
-          <w:sz w:val="24"/>
-          <w:szCs w:val="24"/>
-          <w:lang w:val="en-US"/>
-        </w:rPr>
-        <w:t>api</w:t>
-      </w:r>
-      <w:proofErr w:type="spellEnd"/>
-      <w:r>
-        <w:rPr>
-          <w:sz w:val="24"/>
-          <w:szCs w:val="24"/>
-          <w:lang w:val="en-US"/>
-        </w:rPr>
-        <w:t>-gen (</w:t>
-      </w:r>
-      <w:proofErr w:type="spellStart"/>
-      <w:r>
-        <w:rPr>
-          <w:b/>
-          <w:bCs/>
-          <w:sz w:val="24"/>
-          <w:szCs w:val="24"/>
-          <w:lang w:val="en-US"/>
-        </w:rPr>
-        <w:t>npm</w:t>
-      </w:r>
-      <w:proofErr w:type="spellEnd"/>
-      <w:r>
-        <w:rPr>
-          <w:b/>
-          <w:bCs/>
-          <w:sz w:val="24"/>
-          <w:szCs w:val="24"/>
-          <w:lang w:val="en-US"/>
-        </w:rPr>
-        <w:t xml:space="preserve"> install -g ng-</w:t>
-      </w:r>
-      <w:proofErr w:type="spellStart"/>
-      <w:r>
-        <w:rPr>
-          <w:b/>
-          <w:bCs/>
-          <w:sz w:val="24"/>
-          <w:szCs w:val="24"/>
-          <w:lang w:val="en-US"/>
-        </w:rPr>
-        <w:t>openapi</w:t>
-      </w:r>
-      <w:proofErr w:type="spellEnd"/>
-      <w:r>
-        <w:rPr>
-          <w:b/>
-          <w:bCs/>
-          <w:sz w:val="24"/>
-          <w:szCs w:val="24"/>
-          <w:lang w:val="en-US"/>
-        </w:rPr>
-        <w:t>-gen</w:t>
+        <w:t>Installer une dependances open-api-gen (</w:t>
+      </w:r>
+      <w:r>
+        <w:rPr>
+          <w:b/>
+          <w:bCs/>
+          <w:sz w:val="24"/>
+          <w:szCs w:val="24"/>
+          <w:lang w:val="en-US"/>
+        </w:rPr>
+        <w:t>npm install -g ng-openapi-gen</w:t>
       </w:r>
       <w:r>
         <w:rPr>
@@ -1049,27 +549,14 @@
         </w:rPr>
         <w:t xml:space="preserve">Dans </w:t>
       </w:r>
-      <w:proofErr w:type="spellStart"/>
-      <w:proofErr w:type="gramStart"/>
-      <w:r>
-        <w:rPr>
-          <w:b/>
-          <w:bCs/>
-          <w:sz w:val="24"/>
-          <w:szCs w:val="24"/>
-        </w:rPr>
-        <w:t>package.json</w:t>
-      </w:r>
-      <w:proofErr w:type="spellEnd"/>
-      <w:proofErr w:type="gramEnd"/>
-      <w:r>
-        <w:rPr>
-          <w:b/>
-          <w:bCs/>
-          <w:sz w:val="24"/>
-          <w:szCs w:val="24"/>
-        </w:rPr>
-        <w:t xml:space="preserve"> </w:t>
+      <w:r>
+        <w:rPr>
+          <w:b/>
+          <w:bCs/>
+          <w:sz w:val="24"/>
+          <w:szCs w:val="24"/>
+        </w:rPr>
+        <w:t xml:space="preserve">package.json </w:t>
       </w:r>
       <w:r>
         <w:rPr>
@@ -1111,163 +598,7 @@
           <w:szCs w:val="24"/>
           <w:lang w:val="en-US"/>
         </w:rPr>
-        <w:t>"</w:t>
-      </w:r>
-      <w:proofErr w:type="spellStart"/>
-      <w:proofErr w:type="gramStart"/>
-      <w:r>
-        <w:rPr>
-          <w:b/>
-          <w:bCs/>
-          <w:sz w:val="24"/>
-          <w:szCs w:val="24"/>
-          <w:lang w:val="en-US"/>
-        </w:rPr>
-        <w:t>api</w:t>
-      </w:r>
-      <w:proofErr w:type="spellEnd"/>
-      <w:proofErr w:type="gramEnd"/>
-      <w:r>
-        <w:rPr>
-          <w:b/>
-          <w:bCs/>
-          <w:sz w:val="24"/>
-          <w:szCs w:val="24"/>
-          <w:lang w:val="en-US"/>
-        </w:rPr>
-        <w:t>-gen": "ng-</w:t>
-      </w:r>
-      <w:proofErr w:type="spellStart"/>
-      <w:r>
-        <w:rPr>
-          <w:b/>
-          <w:bCs/>
-          <w:sz w:val="24"/>
-          <w:szCs w:val="24"/>
-          <w:lang w:val="en-US"/>
-        </w:rPr>
-        <w:t>openapi</w:t>
-      </w:r>
-      <w:proofErr w:type="spellEnd"/>
-      <w:r>
-        <w:rPr>
-          <w:b/>
-          <w:bCs/>
-          <w:sz w:val="24"/>
-          <w:szCs w:val="24"/>
-          <w:lang w:val="en-US"/>
-        </w:rPr>
-        <w:t>-gen --input ./</w:t>
-      </w:r>
-      <w:proofErr w:type="spellStart"/>
-      <w:r>
-        <w:rPr>
-          <w:b/>
-          <w:bCs/>
-          <w:sz w:val="24"/>
-          <w:szCs w:val="24"/>
-          <w:lang w:val="en-US"/>
-        </w:rPr>
-        <w:t>src</w:t>
-      </w:r>
-      <w:proofErr w:type="spellEnd"/>
-      <w:r>
-        <w:rPr>
-          <w:b/>
-          <w:bCs/>
-          <w:sz w:val="24"/>
-          <w:szCs w:val="24"/>
-          <w:lang w:val="en-US"/>
-        </w:rPr>
-        <w:t>/</w:t>
-      </w:r>
-      <w:proofErr w:type="spellStart"/>
-      <w:r>
-        <w:rPr>
-          <w:b/>
-          <w:bCs/>
-          <w:sz w:val="24"/>
-          <w:szCs w:val="24"/>
-          <w:lang w:val="en-US"/>
-        </w:rPr>
-        <w:t>openApi</w:t>
-      </w:r>
-      <w:proofErr w:type="spellEnd"/>
-      <w:r>
-        <w:rPr>
-          <w:b/>
-          <w:bCs/>
-          <w:sz w:val="24"/>
-          <w:szCs w:val="24"/>
-          <w:lang w:val="en-US"/>
-        </w:rPr>
-        <w:t>/</w:t>
-      </w:r>
-      <w:proofErr w:type="spellStart"/>
-      <w:r>
-        <w:rPr>
-          <w:b/>
-          <w:bCs/>
-          <w:sz w:val="24"/>
-          <w:szCs w:val="24"/>
-          <w:lang w:val="en-US"/>
-        </w:rPr>
-        <w:t>openApi.json</w:t>
-      </w:r>
-      <w:proofErr w:type="spellEnd"/>
-      <w:r>
-        <w:rPr>
-          <w:b/>
-          <w:bCs/>
-          <w:sz w:val="24"/>
-          <w:szCs w:val="24"/>
-          <w:lang w:val="en-US"/>
-        </w:rPr>
-        <w:t xml:space="preserve"> --</w:t>
-      </w:r>
-      <w:proofErr w:type="gramStart"/>
-      <w:r>
-        <w:rPr>
-          <w:b/>
-          <w:bCs/>
-          <w:sz w:val="24"/>
-          <w:szCs w:val="24"/>
-          <w:lang w:val="en-US"/>
-        </w:rPr>
-        <w:t>output .</w:t>
-      </w:r>
-      <w:proofErr w:type="gramEnd"/>
-      <w:r>
-        <w:rPr>
-          <w:b/>
-          <w:bCs/>
-          <w:sz w:val="24"/>
-          <w:szCs w:val="24"/>
-          <w:lang w:val="en-US"/>
-        </w:rPr>
-        <w:t>/</w:t>
-      </w:r>
-      <w:proofErr w:type="spellStart"/>
-      <w:r>
-        <w:rPr>
-          <w:b/>
-          <w:bCs/>
-          <w:sz w:val="24"/>
-          <w:szCs w:val="24"/>
-          <w:lang w:val="en-US"/>
-        </w:rPr>
-        <w:t>src</w:t>
-      </w:r>
-      <w:proofErr w:type="spellEnd"/>
-      <w:r>
-        <w:rPr>
-          <w:b/>
-          <w:bCs/>
-          <w:sz w:val="24"/>
-          <w:szCs w:val="24"/>
-          <w:lang w:val="en-US"/>
-        </w:rPr>
-        <w:t>/app/services"</w:t>
+        <w:t>"api-gen": "ng-openapi-gen --input ./src/openApi/openApi.json --output ./src/app/services"</w:t>
       </w:r>
       <w:r>
         <w:rPr>
@@ -1313,71 +644,17 @@
           <w:szCs w:val="24"/>
           <w:lang w:val="en-US"/>
         </w:rPr>
-        <w:t xml:space="preserve"> Runner la </w:t>
-      </w:r>
-      <w:proofErr w:type="spellStart"/>
-      <w:proofErr w:type="gramStart"/>
-      <w:r>
-        <w:rPr>
-          <w:sz w:val="24"/>
-          <w:szCs w:val="24"/>
-          <w:lang w:val="en-US"/>
-        </w:rPr>
-        <w:t>commande</w:t>
-      </w:r>
-      <w:proofErr w:type="spellEnd"/>
-      <w:r>
-        <w:rPr>
-          <w:sz w:val="24"/>
-          <w:szCs w:val="24"/>
-          <w:lang w:val="en-US"/>
-        </w:rPr>
-        <w:t xml:space="preserve">  </w:t>
-      </w:r>
-      <w:proofErr w:type="spellStart"/>
-      <w:r>
-        <w:rPr>
-          <w:b/>
-          <w:bCs/>
-          <w:sz w:val="24"/>
-          <w:szCs w:val="24"/>
-          <w:lang w:val="en-US"/>
-        </w:rPr>
-        <w:t>npm</w:t>
-      </w:r>
-      <w:proofErr w:type="spellEnd"/>
-      <w:proofErr w:type="gramEnd"/>
-      <w:r>
-        <w:rPr>
-          <w:b/>
-          <w:bCs/>
-          <w:sz w:val="24"/>
-          <w:szCs w:val="24"/>
-          <w:lang w:val="en-US"/>
-        </w:rPr>
-        <w:t xml:space="preserve"> run </w:t>
-      </w:r>
-      <w:proofErr w:type="spellStart"/>
-      <w:r>
-        <w:rPr>
-          <w:b/>
-          <w:bCs/>
-          <w:sz w:val="24"/>
-          <w:szCs w:val="24"/>
-          <w:lang w:val="en-US"/>
-        </w:rPr>
-        <w:t>api</w:t>
-      </w:r>
-      <w:proofErr w:type="spellEnd"/>
-      <w:r>
-        <w:rPr>
-          <w:b/>
-          <w:bCs/>
-          <w:sz w:val="24"/>
-          <w:szCs w:val="24"/>
-          <w:lang w:val="en-US"/>
-        </w:rPr>
-        <w:t>-gen</w:t>
+        <w:t xml:space="preserve"> Runner la commande  </w:t>
+      </w:r>
+      <w:r>
+        <w:rPr>
+          <w:b/>
+          <w:bCs/>
+          <w:sz w:val="24"/>
+          <w:szCs w:val="24"/>
+          <w:lang w:val="en-US"/>
+        </w:rPr>
+        <w:t>npm run api-gen</w:t>
       </w:r>
     </w:p>
     <w:p>
@@ -1413,40 +690,21 @@
         </w:rPr>
         <w:t xml:space="preserve">Dans </w:t>
       </w:r>
-      <w:proofErr w:type="spellStart"/>
-      <w:r>
-        <w:rPr>
-          <w:b/>
-          <w:bCs/>
-          <w:sz w:val="24"/>
-          <w:szCs w:val="24"/>
-        </w:rPr>
-        <w:t>main.ts</w:t>
-      </w:r>
-      <w:proofErr w:type="spellEnd"/>
-      <w:r>
-        <w:rPr>
-          <w:b/>
-          <w:bCs/>
-          <w:sz w:val="24"/>
-          <w:szCs w:val="24"/>
-        </w:rPr>
-        <w:t xml:space="preserve"> </w:t>
-      </w:r>
-      <w:r>
-        <w:rPr>
-          <w:sz w:val="24"/>
-          <w:szCs w:val="24"/>
-        </w:rPr>
-        <w:t xml:space="preserve">identifier </w:t>
-      </w:r>
-      <w:proofErr w:type="gramStart"/>
-      <w:r>
-        <w:rPr>
-          <w:sz w:val="24"/>
-          <w:szCs w:val="24"/>
-        </w:rPr>
-        <w:t>l</w:t>
+      <w:r>
+        <w:rPr>
+          <w:b/>
+          <w:bCs/>
+          <w:sz w:val="24"/>
+          <w:szCs w:val="24"/>
+        </w:rPr>
+        <w:t xml:space="preserve">main.ts </w:t>
+      </w:r>
+      <w:r>
+        <w:rPr>
+          <w:sz w:val="24"/>
+          <w:szCs w:val="24"/>
+        </w:rPr>
+        <w:t>identifier l</w:t>
       </w:r>
       <w:r>
         <w:rPr>
@@ -1462,17 +720,7 @@
           <w:sz w:val="24"/>
           <w:szCs w:val="24"/>
         </w:rPr>
-        <w:t>providers</w:t>
-      </w:r>
-      <w:proofErr w:type="gramEnd"/>
-      <w:r>
-        <w:rPr>
-          <w:b/>
-          <w:bCs/>
-          <w:sz w:val="24"/>
-          <w:szCs w:val="24"/>
-        </w:rPr>
-        <w:t xml:space="preserve"> </w:t>
+        <w:t xml:space="preserve">providers </w:t>
       </w:r>
       <w:r>
         <w:rPr>
@@ -1481,49 +729,72 @@
         </w:rPr>
         <w:t xml:space="preserve">tel </w:t>
       </w:r>
-      <w:proofErr w:type="spellStart"/>
-      <w:r>
-        <w:rPr>
-          <w:b/>
-          <w:bCs/>
-          <w:sz w:val="24"/>
-          <w:szCs w:val="24"/>
-        </w:rPr>
-        <w:t>httpClinet</w:t>
-      </w:r>
-      <w:proofErr w:type="spellEnd"/>
-      <w:r>
-        <w:rPr>
-          <w:b/>
-          <w:bCs/>
-          <w:sz w:val="24"/>
-          <w:szCs w:val="24"/>
-        </w:rPr>
-        <w:t>.</w:t>
-      </w:r>
-    </w:p>
-    <w:p>
-      <w:pPr>
-        <w:pStyle w:val="ListParagraph"/>
-        <w:rPr>
-          <w:b/>
-          <w:bCs/>
-          <w:sz w:val="24"/>
-          <w:szCs w:val="24"/>
-        </w:rPr>
-      </w:pPr>
-    </w:p>
-    <w:p>
-      <w:pPr>
-        <w:pStyle w:val="ListParagraph"/>
-        <w:ind w:left="1080"/>
-        <w:rPr>
-          <w:b/>
-          <w:bCs/>
-          <w:sz w:val="24"/>
-          <w:szCs w:val="24"/>
-        </w:rPr>
-      </w:pPr>
+      <w:r>
+        <w:rPr>
+          <w:b/>
+          <w:bCs/>
+          <w:sz w:val="24"/>
+          <w:szCs w:val="24"/>
+        </w:rPr>
+        <w:t>httpClinet.</w:t>
+      </w:r>
+    </w:p>
+    <w:p>
+      <w:pPr>
+        <w:pStyle w:val="ListParagraph"/>
+        <w:rPr>
+          <w:b/>
+          <w:bCs/>
+          <w:sz w:val="24"/>
+          <w:szCs w:val="24"/>
+        </w:rPr>
+      </w:pPr>
+    </w:p>
+    <w:p>
+      <w:pPr>
+        <w:rPr>
+          <w:b/>
+          <w:bCs/>
+          <w:sz w:val="24"/>
+          <w:szCs w:val="24"/>
+        </w:rPr>
+      </w:pPr>
+      <w:r>
+        <w:rPr>
+          <w:b/>
+          <w:bCs/>
+          <w:sz w:val="24"/>
+          <w:szCs w:val="24"/>
+        </w:rPr>
+        <w:sym w:font="Wingdings" w:char="F0E8"/>
+      </w:r>
+      <w:r>
+        <w:rPr>
+          <w:b/>
+          <w:bCs/>
+          <w:sz w:val="24"/>
+          <w:szCs w:val="24"/>
+        </w:rPr>
+        <w:t xml:space="preserve"> Depuis la version « 1.0+ »  OpenApi n’utilise pas observeble (RxJs) donc on utilise </w:t>
+      </w:r>
+      <w:r>
+        <w:rPr>
+          <w:b/>
+          <w:bCs/>
+          <w:sz w:val="24"/>
+          <w:szCs w:val="24"/>
+        </w:rPr>
+        <w:t>Promise par défaut (plus simple, natif, compatible avec async/await)</w:t>
+      </w:r>
+      <w:r>
+        <w:rPr>
+          <w:b/>
+          <w:bCs/>
+          <w:sz w:val="24"/>
+          <w:szCs w:val="24"/>
+        </w:rPr>
+        <w:t xml:space="preserve"> .</w:t>
+      </w:r>
     </w:p>
     <w:p>
       <w:pPr>
@@ -1539,25 +810,14 @@
           <w:szCs w:val="24"/>
         </w:rPr>
       </w:pPr>
-      <w:proofErr w:type="spellStart"/>
-      <w:r>
-        <w:rPr>
-          <w:b/>
-          <w:bCs/>
-          <w:sz w:val="24"/>
-          <w:szCs w:val="24"/>
-        </w:rPr>
-        <w:t>Authentication</w:t>
-      </w:r>
-      <w:proofErr w:type="spellEnd"/>
-      <w:r>
-        <w:rPr>
-          <w:b/>
-          <w:bCs/>
-          <w:sz w:val="24"/>
-          <w:szCs w:val="24"/>
-        </w:rPr>
-        <w:t xml:space="preserve"> </w:t>
+      <w:r>
+        <w:rPr>
+          <w:b/>
+          <w:bCs/>
+          <w:sz w:val="24"/>
+          <w:szCs w:val="24"/>
+        </w:rPr>
+        <w:t xml:space="preserve">Authentication </w:t>
       </w:r>
     </w:p>
     <w:p>
@@ -1600,48 +860,7 @@
           <w:sz w:val="24"/>
           <w:szCs w:val="24"/>
         </w:rPr>
-        <w:t xml:space="preserve">(on créer un service </w:t>
-      </w:r>
-      <w:proofErr w:type="spellStart"/>
-      <w:r>
-        <w:rPr>
-          <w:sz w:val="24"/>
-          <w:szCs w:val="24"/>
-        </w:rPr>
-        <w:t>token</w:t>
-      </w:r>
-      <w:proofErr w:type="spellEnd"/>
-      <w:r>
-        <w:rPr>
-          <w:sz w:val="24"/>
-          <w:szCs w:val="24"/>
-        </w:rPr>
-        <w:t xml:space="preserve"> dans services </w:t>
-      </w:r>
-      <w:proofErr w:type="spellStart"/>
-      <w:proofErr w:type="gramStart"/>
-      <w:r>
-        <w:rPr>
-          <w:sz w:val="24"/>
-          <w:szCs w:val="24"/>
-        </w:rPr>
-        <w:t>openApi</w:t>
-      </w:r>
-      <w:proofErr w:type="spellEnd"/>
-      <w:r>
-        <w:rPr>
-          <w:sz w:val="24"/>
-          <w:szCs w:val="24"/>
-        </w:rPr>
-        <w:t xml:space="preserve"> )</w:t>
-      </w:r>
-      <w:proofErr w:type="gramEnd"/>
-      <w:r>
-        <w:rPr>
-          <w:sz w:val="24"/>
-          <w:szCs w:val="24"/>
-        </w:rPr>
-        <w:t>.</w:t>
+        <w:t>(on créer un service token dans services openApi ).</w:t>
       </w:r>
     </w:p>
     <w:p>
@@ -1716,38 +935,15 @@
           <w:szCs w:val="24"/>
         </w:rPr>
       </w:pPr>
-      <w:proofErr w:type="spellStart"/>
-      <w:r>
-        <w:rPr>
-          <w:b/>
-          <w:bCs/>
-          <w:sz w:val="24"/>
-          <w:szCs w:val="24"/>
-        </w:rPr>
-        <w:lastRenderedPageBreak/>
-        <w:t>Activate</w:t>
-      </w:r>
-      <w:proofErr w:type="spellEnd"/>
-      <w:r>
-        <w:rPr>
-          <w:b/>
-          <w:bCs/>
-          <w:sz w:val="24"/>
-          <w:szCs w:val="24"/>
-        </w:rPr>
-        <w:t xml:space="preserve"> </w:t>
-      </w:r>
-      <w:proofErr w:type="spellStart"/>
-      <w:r>
-        <w:rPr>
-          <w:b/>
-          <w:bCs/>
-          <w:sz w:val="24"/>
-          <w:szCs w:val="24"/>
-        </w:rPr>
-        <w:t>account</w:t>
-      </w:r>
-      <w:proofErr w:type="spellEnd"/>
+      <w:r>
+        <w:rPr>
+          <w:b/>
+          <w:bCs/>
+          <w:sz w:val="24"/>
+          <w:szCs w:val="24"/>
+        </w:rPr>
+        <w:t>Activate account</w:t>
+      </w:r>
     </w:p>
     <w:p>
       <w:pPr>
@@ -1764,67 +960,23 @@
           <w:lang w:val="en-US"/>
         </w:rPr>
       </w:pPr>
-      <w:proofErr w:type="spellStart"/>
-      <w:r>
-        <w:rPr>
-          <w:sz w:val="24"/>
-          <w:szCs w:val="24"/>
-          <w:lang w:val="en-US"/>
-        </w:rPr>
-        <w:t>Ajouter</w:t>
-      </w:r>
-      <w:proofErr w:type="spellEnd"/>
-      <w:r>
-        <w:rPr>
-          <w:sz w:val="24"/>
-          <w:szCs w:val="24"/>
-          <w:lang w:val="en-US"/>
-        </w:rPr>
-        <w:t xml:space="preserve"> </w:t>
-      </w:r>
-      <w:proofErr w:type="spellStart"/>
-      <w:r>
-        <w:rPr>
-          <w:b/>
-          <w:bCs/>
-          <w:sz w:val="24"/>
-          <w:szCs w:val="24"/>
-          <w:lang w:val="en-US"/>
-        </w:rPr>
-        <w:t>npm</w:t>
-      </w:r>
-      <w:proofErr w:type="spellEnd"/>
-      <w:r>
-        <w:rPr>
-          <w:b/>
-          <w:bCs/>
-          <w:sz w:val="24"/>
-          <w:szCs w:val="24"/>
-          <w:lang w:val="en-US"/>
-        </w:rPr>
-        <w:t xml:space="preserve"> </w:t>
-      </w:r>
-      <w:proofErr w:type="spellStart"/>
-      <w:r>
-        <w:rPr>
-          <w:b/>
-          <w:bCs/>
-          <w:sz w:val="24"/>
-          <w:szCs w:val="24"/>
-          <w:lang w:val="en-US"/>
-        </w:rPr>
-        <w:t>i</w:t>
-      </w:r>
-      <w:proofErr w:type="spellEnd"/>
-      <w:r>
-        <w:rPr>
-          <w:b/>
-          <w:bCs/>
-          <w:sz w:val="24"/>
-          <w:szCs w:val="24"/>
-          <w:lang w:val="en-US"/>
-        </w:rPr>
-        <w:t> angular-code-input</w:t>
+      <w:r>
+        <w:rPr>
+          <w:sz w:val="24"/>
+          <w:szCs w:val="24"/>
+          <w:lang w:val="en-US"/>
+        </w:rPr>
+        <w:t xml:space="preserve">Ajouter </w:t>
+      </w:r>
+      <w:r>
+        <w:rPr>
+          <w:b/>
+          <w:bCs/>
+          <w:sz w:val="24"/>
+          <w:szCs w:val="24"/>
+          <w:lang w:val="en-US"/>
+        </w:rPr>
+        <w:t>npm i angular-code-input</w:t>
       </w:r>
     </w:p>
     <w:p>
@@ -1848,16 +1000,7 @@
           <w:szCs w:val="24"/>
           <w:lang w:val="en-US"/>
         </w:rPr>
-        <w:t xml:space="preserve">Auth et </w:t>
-      </w:r>
-      <w:proofErr w:type="gramStart"/>
-      <w:r>
-        <w:rPr>
-          <w:sz w:val="24"/>
-          <w:szCs w:val="24"/>
-          <w:lang w:val="en-US"/>
-        </w:rPr>
-        <w:t xml:space="preserve">activate </w:t>
+        <w:t xml:space="preserve">Auth et activate </w:t>
       </w:r>
       <w:r>
         <w:rPr>
@@ -1867,7 +1010,6 @@
         </w:rPr>
         <w:t>.</w:t>
       </w:r>
-      <w:proofErr w:type="gramEnd"/>
     </w:p>
     <w:p>
       <w:pPr>
@@ -1905,7 +1047,391 @@
           <w:szCs w:val="24"/>
           <w:lang w:val="en-US"/>
         </w:rPr>
-        <w:t>Book module (8h:00)</w:t>
+        <w:t>Book module (8h:00</w:t>
+      </w:r>
+      <w:r>
+        <w:rPr>
+          <w:b/>
+          <w:bCs/>
+          <w:sz w:val="24"/>
+          <w:szCs w:val="24"/>
+          <w:lang w:val="en-US"/>
+        </w:rPr>
+        <w:t>)</w:t>
+      </w:r>
+    </w:p>
+    <w:p>
+      <w:pPr>
+        <w:pStyle w:val="ListParagraph"/>
+        <w:numPr>
+          <w:ilvl w:val="0"/>
+          <w:numId w:val="4"/>
+        </w:numPr>
+        <w:spacing w:line="360" w:lineRule="auto"/>
+        <w:rPr>
+          <w:rFonts w:ascii="Times New Roman" w:hAnsi="Times New Roman" w:cs="Times New Roman"/>
+          <w:sz w:val="24"/>
+          <w:szCs w:val="24"/>
+        </w:rPr>
+      </w:pPr>
+      <w:r>
+        <w:rPr>
+          <w:rFonts w:ascii="Times New Roman" w:hAnsi="Times New Roman" w:cs="Times New Roman"/>
+          <w:b/>
+          <w:bCs/>
+          <w:sz w:val="24"/>
+          <w:szCs w:val="24"/>
+        </w:rPr>
+        <w:t>Compoenet book-list ,</w:t>
+      </w:r>
+      <w:r>
+        <w:rPr>
+          <w:rFonts w:ascii="Times New Roman" w:hAnsi="Times New Roman" w:cs="Times New Roman"/>
+          <w:sz w:val="24"/>
+          <w:szCs w:val="24"/>
+        </w:rPr>
+        <w:t xml:space="preserve"> </w:t>
+      </w:r>
+      <w:r>
+        <w:rPr>
+          <w:rFonts w:ascii="Times New Roman" w:hAnsi="Times New Roman" w:cs="Times New Roman"/>
+          <w:sz w:val="24"/>
+          <w:szCs w:val="24"/>
+        </w:rPr>
+        <w:t>on va recuperer la</w:t>
+      </w:r>
+      <w:r>
+        <w:rPr>
+          <w:rFonts w:ascii="Times New Roman" w:hAnsi="Times New Roman" w:cs="Times New Roman"/>
+          <w:sz w:val="24"/>
+          <w:szCs w:val="24"/>
+        </w:rPr>
+        <w:t xml:space="preserve"> liste des books. </w:t>
+      </w:r>
+    </w:p>
+    <w:p>
+      <w:pPr>
+        <w:pStyle w:val="ListParagraph"/>
+        <w:spacing w:line="360" w:lineRule="auto"/>
+        <w:rPr>
+          <w:rFonts w:ascii="Times New Roman" w:hAnsi="Times New Roman" w:cs="Times New Roman"/>
+          <w:sz w:val="24"/>
+          <w:szCs w:val="24"/>
+        </w:rPr>
+      </w:pPr>
+      <w:r>
+        <w:rPr>
+          <w:rFonts w:ascii="Times New Roman" w:hAnsi="Times New Roman" w:cs="Times New Roman"/>
+          <w:sz w:val="24"/>
+          <w:szCs w:val="24"/>
+        </w:rPr>
+        <w:t xml:space="preserve">Lors denvoyer la requette get avec fonction </w:t>
+      </w:r>
+      <w:r>
+        <w:rPr>
+          <w:rFonts w:ascii="Times New Roman" w:hAnsi="Times New Roman" w:cs="Times New Roman"/>
+          <w:b/>
+          <w:bCs/>
+          <w:sz w:val="24"/>
+          <w:szCs w:val="24"/>
+        </w:rPr>
+        <w:t>findAllBooks</w:t>
+      </w:r>
+      <w:r>
+        <w:rPr>
+          <w:rFonts w:ascii="Times New Roman" w:hAnsi="Times New Roman" w:cs="Times New Roman"/>
+          <w:sz w:val="24"/>
+          <w:szCs w:val="24"/>
+        </w:rPr>
+        <w:t xml:space="preserve"> un erreur </w:t>
+      </w:r>
+      <w:r>
+        <w:rPr>
+          <w:rFonts w:ascii="Times New Roman" w:hAnsi="Times New Roman" w:cs="Times New Roman"/>
+          <w:b/>
+          <w:bCs/>
+          <w:sz w:val="24"/>
+          <w:szCs w:val="24"/>
+        </w:rPr>
+        <w:t>network (403).</w:t>
+      </w:r>
+    </w:p>
+    <w:p>
+      <w:pPr>
+        <w:pStyle w:val="ListParagraph"/>
+        <w:spacing w:line="360" w:lineRule="auto"/>
+        <w:rPr>
+          <w:rFonts w:ascii="Times New Roman" w:hAnsi="Times New Roman" w:cs="Times New Roman"/>
+          <w:sz w:val="24"/>
+          <w:szCs w:val="24"/>
+        </w:rPr>
+      </w:pPr>
+      <w:r>
+        <w:rPr>
+          <w:rFonts w:ascii="Times New Roman" w:hAnsi="Times New Roman" w:cs="Times New Roman"/>
+          <w:sz w:val="24"/>
+          <w:szCs w:val="24"/>
+        </w:rPr>
+        <w:t>Cette erreur</w:t>
+      </w:r>
+      <w:r>
+        <w:rPr>
+          <w:rFonts w:ascii="Times New Roman" w:hAnsi="Times New Roman" w:cs="Times New Roman"/>
+          <w:sz w:val="24"/>
+          <w:szCs w:val="24"/>
+        </w:rPr>
+        <w:t xml:space="preserve"> </w:t>
+      </w:r>
+      <w:r>
+        <w:rPr>
+          <w:rFonts w:ascii="Times New Roman" w:hAnsi="Times New Roman" w:cs="Times New Roman"/>
+          <w:sz w:val="24"/>
+          <w:szCs w:val="24"/>
+        </w:rPr>
+        <w:t>à</w:t>
+      </w:r>
+      <w:r>
+        <w:rPr>
+          <w:rFonts w:ascii="Times New Roman" w:hAnsi="Times New Roman" w:cs="Times New Roman"/>
+          <w:sz w:val="24"/>
+          <w:szCs w:val="24"/>
+        </w:rPr>
+        <w:t xml:space="preserve"> cause </w:t>
+      </w:r>
+      <w:r>
+        <w:rPr>
+          <w:rFonts w:ascii="Times New Roman" w:hAnsi="Times New Roman" w:cs="Times New Roman"/>
+          <w:sz w:val="24"/>
+          <w:szCs w:val="24"/>
+        </w:rPr>
+        <w:t>d’autorisation</w:t>
+      </w:r>
+      <w:r>
+        <w:rPr>
+          <w:rFonts w:ascii="Times New Roman" w:hAnsi="Times New Roman" w:cs="Times New Roman"/>
+          <w:sz w:val="24"/>
+          <w:szCs w:val="24"/>
+        </w:rPr>
+        <w:t xml:space="preserve">. </w:t>
+      </w:r>
+    </w:p>
+    <w:p>
+      <w:pPr>
+        <w:pStyle w:val="ListParagraph"/>
+        <w:spacing w:line="360" w:lineRule="auto"/>
+        <w:rPr>
+          <w:rFonts w:ascii="Times New Roman" w:hAnsi="Times New Roman" w:cs="Times New Roman"/>
+          <w:b/>
+          <w:bCs/>
+          <w:sz w:val="24"/>
+          <w:szCs w:val="24"/>
+        </w:rPr>
+      </w:pPr>
+      <w:r>
+        <w:rPr>
+          <w:rFonts w:ascii="Times New Roman" w:hAnsi="Times New Roman" w:cs="Times New Roman"/>
+          <w:sz w:val="24"/>
+          <w:szCs w:val="24"/>
+        </w:rPr>
+        <w:t xml:space="preserve">La solution </w:t>
+      </w:r>
+      <w:r>
+        <w:rPr>
+          <w:rFonts w:ascii="Times New Roman" w:hAnsi="Times New Roman" w:cs="Times New Roman"/>
+          <w:sz w:val="24"/>
+          <w:szCs w:val="24"/>
+        </w:rPr>
+        <w:t>est-il</w:t>
+      </w:r>
+      <w:r>
+        <w:rPr>
+          <w:rFonts w:ascii="Times New Roman" w:hAnsi="Times New Roman" w:cs="Times New Roman"/>
+          <w:sz w:val="24"/>
+          <w:szCs w:val="24"/>
+        </w:rPr>
+        <w:t xml:space="preserve"> faut crrer un </w:t>
+      </w:r>
+      <w:r>
+        <w:rPr>
+          <w:rFonts w:ascii="Times New Roman" w:hAnsi="Times New Roman" w:cs="Times New Roman"/>
+          <w:b/>
+          <w:bCs/>
+          <w:sz w:val="24"/>
+          <w:szCs w:val="24"/>
+        </w:rPr>
+        <w:t xml:space="preserve">intercepetur </w:t>
+      </w:r>
+      <w:r>
+        <w:rPr>
+          <w:rFonts w:ascii="Times New Roman" w:hAnsi="Times New Roman" w:cs="Times New Roman"/>
+          <w:sz w:val="24"/>
+          <w:szCs w:val="24"/>
+        </w:rPr>
+        <w:t xml:space="preserve">qui va ajouter le </w:t>
+      </w:r>
+      <w:r>
+        <w:rPr>
+          <w:rFonts w:ascii="Times New Roman" w:hAnsi="Times New Roman" w:cs="Times New Roman"/>
+          <w:b/>
+          <w:bCs/>
+          <w:sz w:val="24"/>
+          <w:szCs w:val="24"/>
+        </w:rPr>
+        <w:t>token</w:t>
+      </w:r>
+      <w:r>
+        <w:rPr>
+          <w:rFonts w:ascii="Times New Roman" w:hAnsi="Times New Roman" w:cs="Times New Roman"/>
+          <w:sz w:val="24"/>
+          <w:szCs w:val="24"/>
+        </w:rPr>
+        <w:t xml:space="preserve"> a chaque requette envoyer </w:t>
+      </w:r>
+      <w:r>
+        <w:rPr>
+          <w:rFonts w:ascii="Times New Roman" w:hAnsi="Times New Roman" w:cs="Times New Roman"/>
+          <w:sz w:val="24"/>
+          <w:szCs w:val="24"/>
+        </w:rPr>
+        <w:t>à</w:t>
+      </w:r>
+      <w:r>
+        <w:rPr>
+          <w:rFonts w:ascii="Times New Roman" w:hAnsi="Times New Roman" w:cs="Times New Roman"/>
+          <w:sz w:val="24"/>
+          <w:szCs w:val="24"/>
+        </w:rPr>
+        <w:t xml:space="preserve"> notre back-end. </w:t>
+      </w:r>
+      <w:r>
+        <w:rPr>
+          <w:rFonts w:ascii="Times New Roman" w:hAnsi="Times New Roman" w:cs="Times New Roman"/>
+          <w:b/>
+          <w:bCs/>
+          <w:sz w:val="24"/>
+          <w:szCs w:val="24"/>
+        </w:rPr>
+        <w:t xml:space="preserve"> </w:t>
+      </w:r>
+    </w:p>
+    <w:p>
+      <w:pPr>
+        <w:pStyle w:val="ListParagraph"/>
+        <w:numPr>
+          <w:ilvl w:val="0"/>
+          <w:numId w:val="3"/>
+        </w:numPr>
+        <w:spacing w:line="360" w:lineRule="auto"/>
+        <w:rPr>
+          <w:rFonts w:ascii="Times New Roman" w:hAnsi="Times New Roman" w:cs="Times New Roman"/>
+          <w:b/>
+          <w:bCs/>
+          <w:sz w:val="24"/>
+          <w:szCs w:val="24"/>
+        </w:rPr>
+      </w:pPr>
+      <w:r>
+        <w:rPr>
+          <w:rFonts w:ascii="Times New Roman" w:hAnsi="Times New Roman" w:cs="Times New Roman"/>
+          <w:sz w:val="24"/>
+          <w:szCs w:val="24"/>
+        </w:rPr>
+        <w:t>Dans</w:t>
+      </w:r>
+      <w:r>
+        <w:rPr>
+          <w:rFonts w:ascii="Times New Roman" w:hAnsi="Times New Roman" w:cs="Times New Roman"/>
+          <w:sz w:val="24"/>
+          <w:szCs w:val="24"/>
+        </w:rPr>
+        <w:t xml:space="preserve"> dossier </w:t>
+      </w:r>
+      <w:r>
+        <w:rPr>
+          <w:rFonts w:ascii="Times New Roman" w:hAnsi="Times New Roman" w:cs="Times New Roman"/>
+          <w:b/>
+          <w:bCs/>
+          <w:sz w:val="24"/>
+          <w:szCs w:val="24"/>
+        </w:rPr>
+        <w:t xml:space="preserve">services </w:t>
+      </w:r>
+      <w:r>
+        <w:rPr>
+          <w:rFonts w:ascii="Times New Roman" w:hAnsi="Times New Roman" w:cs="Times New Roman"/>
+          <w:sz w:val="24"/>
+          <w:szCs w:val="24"/>
+        </w:rPr>
+        <w:t xml:space="preserve">on crerr un dossier </w:t>
+      </w:r>
+      <w:r>
+        <w:rPr>
+          <w:rFonts w:ascii="Times New Roman" w:hAnsi="Times New Roman" w:cs="Times New Roman"/>
+          <w:b/>
+          <w:bCs/>
+          <w:sz w:val="24"/>
+          <w:szCs w:val="24"/>
+        </w:rPr>
+        <w:t xml:space="preserve">interceptor </w:t>
+      </w:r>
+      <w:r>
+        <w:rPr>
+          <w:rFonts w:ascii="Times New Roman" w:hAnsi="Times New Roman" w:cs="Times New Roman"/>
+          <w:sz w:val="24"/>
+          <w:szCs w:val="24"/>
+        </w:rPr>
+        <w:t>dans la quel on créer un interceptor « ng g interceptor http-token ».</w:t>
+      </w:r>
+    </w:p>
+    <w:p>
+      <w:pPr>
+        <w:pStyle w:val="ListParagraph"/>
+        <w:numPr>
+          <w:ilvl w:val="0"/>
+          <w:numId w:val="3"/>
+        </w:numPr>
+        <w:spacing w:line="360" w:lineRule="auto"/>
+        <w:rPr>
+          <w:rFonts w:ascii="Times New Roman" w:hAnsi="Times New Roman" w:cs="Times New Roman"/>
+          <w:b/>
+          <w:bCs/>
+          <w:sz w:val="24"/>
+          <w:szCs w:val="24"/>
+        </w:rPr>
+      </w:pPr>
+      <w:r>
+        <w:rPr>
+          <w:rFonts w:ascii="Times New Roman" w:hAnsi="Times New Roman" w:cs="Times New Roman"/>
+          <w:sz w:val="24"/>
+          <w:szCs w:val="24"/>
+        </w:rPr>
+        <w:t>Ajouter</w:t>
+      </w:r>
+      <w:r>
+        <w:rPr>
+          <w:rFonts w:ascii="Times New Roman" w:hAnsi="Times New Roman" w:cs="Times New Roman"/>
+          <w:sz w:val="24"/>
+          <w:szCs w:val="24"/>
+        </w:rPr>
+        <w:t xml:space="preserve"> interceptor</w:t>
+      </w:r>
+      <w:r>
+        <w:rPr>
+          <w:rFonts w:ascii="Times New Roman" w:hAnsi="Times New Roman" w:cs="Times New Roman"/>
+          <w:sz w:val="24"/>
+          <w:szCs w:val="24"/>
+        </w:rPr>
+        <w:t xml:space="preserve"> dans </w:t>
+      </w:r>
+      <w:r>
+        <w:rPr>
+          <w:rFonts w:ascii="Times New Roman" w:hAnsi="Times New Roman" w:cs="Times New Roman"/>
+          <w:b/>
+          <w:bCs/>
+          <w:sz w:val="24"/>
+          <w:szCs w:val="24"/>
+        </w:rPr>
+        <w:t>Main.ts</w:t>
       </w:r>
     </w:p>
     <w:p>
@@ -1915,28 +1441,111 @@
         <w:rPr>
           <w:sz w:val="24"/>
           <w:szCs w:val="24"/>
-          <w:lang w:val="en-US"/>
-        </w:rPr>
-      </w:pPr>
-    </w:p>
-    <w:p>
-      <w:pPr>
-        <w:pStyle w:val="ListParagraph"/>
-        <w:rPr>
-          <w:sz w:val="24"/>
-          <w:szCs w:val="24"/>
-          <w:lang w:val="en-US"/>
-        </w:rPr>
-      </w:pPr>
-    </w:p>
-    <w:p>
-      <w:pPr>
-        <w:pStyle w:val="ListParagraph"/>
-        <w:ind w:left="1080"/>
-        <w:rPr>
-          <w:sz w:val="24"/>
-          <w:szCs w:val="24"/>
-          <w:lang w:val="en-US"/>
+        </w:rPr>
+      </w:pPr>
+    </w:p>
+    <w:p>
+      <w:pPr>
+        <w:pStyle w:val="ListParagraph"/>
+        <w:numPr>
+          <w:ilvl w:val="0"/>
+          <w:numId w:val="4"/>
+        </w:numPr>
+        <w:rPr>
+          <w:b/>
+          <w:bCs/>
+          <w:sz w:val="24"/>
+          <w:szCs w:val="24"/>
+        </w:rPr>
+      </w:pPr>
+      <w:r>
+        <w:rPr>
+          <w:b/>
+          <w:bCs/>
+          <w:sz w:val="24"/>
+          <w:szCs w:val="24"/>
+        </w:rPr>
+        <w:t>BookCardComponent</w:t>
+      </w:r>
+      <w:r>
+        <w:rPr>
+          <w:b/>
+          <w:bCs/>
+          <w:sz w:val="24"/>
+          <w:szCs w:val="24"/>
+        </w:rPr>
+        <w:t> :</w:t>
+      </w:r>
+      <w:r>
+        <w:rPr>
+          <w:sz w:val="24"/>
+          <w:szCs w:val="24"/>
+        </w:rPr>
+        <w:t xml:space="preserve"> (8h43)</w:t>
+      </w:r>
+      <w:r>
+        <w:rPr>
+          <w:sz w:val="24"/>
+          <w:szCs w:val="24"/>
+        </w:rPr>
+        <w:t>.</w:t>
+      </w:r>
+    </w:p>
+    <w:p>
+      <w:pPr>
+        <w:pStyle w:val="ListParagraph"/>
+        <w:ind w:left="1440"/>
+        <w:rPr>
+          <w:b/>
+          <w:bCs/>
+          <w:sz w:val="24"/>
+          <w:szCs w:val="24"/>
+        </w:rPr>
+      </w:pPr>
+    </w:p>
+    <w:p>
+      <w:pPr>
+        <w:pStyle w:val="ListParagraph"/>
+        <w:ind w:left="1440"/>
+        <w:rPr>
+          <w:b/>
+          <w:bCs/>
+          <w:sz w:val="24"/>
+          <w:szCs w:val="24"/>
+        </w:rPr>
+      </w:pPr>
+      <w:r>
+        <w:rPr>
+          <w:b/>
+          <w:bCs/>
+          <w:sz w:val="24"/>
+          <w:szCs w:val="24"/>
+        </w:rPr>
+        <w:t>9h15</w:t>
+      </w:r>
+    </w:p>
+    <w:p>
+      <w:pPr>
+        <w:rPr>
+          <w:b/>
+          <w:bCs/>
+          <w:sz w:val="24"/>
+          <w:szCs w:val="24"/>
+        </w:rPr>
+      </w:pPr>
+      <w:r>
+        <w:rPr>
+          <w:sz w:val="24"/>
+          <w:szCs w:val="24"/>
+        </w:rPr>
+        <w:t xml:space="preserve"> </w:t>
+      </w:r>
+    </w:p>
+    <w:p>
+      <w:pPr>
+        <w:rPr>
+          <w:sz w:val="24"/>
+          <w:szCs w:val="24"/>
         </w:rPr>
       </w:pPr>
     </w:p>
@@ -1953,6 +1562,208 @@
 <file path=word/numbering.xml><?xml version="1.0" encoding="utf-8"?>
 <w:numbering xmlns:wpc="http://schemas.microsoft.com/office/word/2010/wordprocessingCanvas" xmlns:cx="http://schemas.microsoft.com/office/drawing/2014/chartex" xmlns:cx1="http://schemas.microsoft.com/office/drawing/2015/9/8/chartex" xmlns:cx2="http://schemas.microsoft.com/office/drawing/2015/10/21/chartex" xmlns:cx3="http://schemas.microsoft.com/office/drawing/2016/5/9/chartex" xmlns:cx4="http://schemas.microsoft.com/office/drawing/2016/5/10/chartex" xmlns:cx5="http://schemas.microsoft.com/office/drawing/2016/5/11/chartex" xmlns:cx6="http://schemas.microsoft.com/office/drawing/2016/5/12/chartex" xmlns:cx7="http://schemas.microsoft.com/office/drawing/2016/5/13/chartex" xmlns:cx8="http://schemas.microsoft.com/office/drawing/2016/5/14/chartex" xmlns:mc="http://schemas.openxmlformats.org/markup-compatibility/2006" xmlns:aink="http://schemas.microsoft.com/office/drawing/2016/ink" xmlns:am3d="http://schemas.microsoft.com/office/drawing/2017/model3d" xmlns:o="urn:schemas-microsoft-com:office:office" xmlns:oel="http://schemas.microsoft.com/office/2019/extlst" xmlns:r="http://schemas.openxmlformats.org/officeDocument/2006/relationships" xmlns:m="http://schemas.openxmlformats.org/officeDocument/2006/math" xmlns:v="urn:schemas-microsoft-com:vml" xmlns:wp14="http://schemas.microsoft.com/office/word/2010/wordprocessingDrawing" xmlns:wp="http://schemas.openxmlformats.org/drawingml/2006/wordprocessingDrawing" xmlns:w10="urn:schemas-microsoft-com:office:word" xmlns:w="http://schemas.openxmlformats.org/wordprocessingml/2006/main" xmlns:w14="http://schemas.microsoft.com/office/word/2010/wordml" xmlns:w15="http://schemas.microsoft.com/office/word/2012/wordml" xmlns:w16cex="http://schemas.microsoft.com/office/word/2018/wordml/cex" xmlns:w16cid="http://schemas.microsoft.com/office/word/2016/wordml/cid" xmlns:w16="http://schemas.microsoft.com/office/word/2018/wordml" xmlns:w16du="http://schemas.microsoft.com/office/word/2023/wordml/word16du" xmlns:w16sdtdh="http://schemas.microsoft.com/office/word/2020/wordml/sdtdatahash" xmlns:w16sdtfl="http://schemas.microsoft.com/office/word/2024/wordml/sdtformatlock" xmlns:w16se="http://schemas.microsoft.com/office/word/2015/wordml/symex" xmlns:wpg="http://schemas.microsoft.com/office/word/2010/wordprocessingGroup" xmlns:wpi="http://schemas.microsoft.com/office/word/2010/wordprocessingInk" xmlns:wne="http://schemas.microsoft.com/office/word/2006/wordml" xmlns:wps="http://schemas.microsoft.com/office/word/2010/wordprocessingShape" mc:Ignorable="w14 w15 w16se w16cid w16 w16cex w16sdtdh w16sdtfl w16du wp14">
   <w:abstractNum w:abstractNumId="0" w15:restartNumberingAfterBreak="0">
+    <w:nsid w:val="11632FF7"/>
+    <w:multiLevelType w:val="hybridMultilevel"/>
+    <w:tmpl w:val="18FCC21C"/>
+    <w:lvl w:ilvl="0" w:tplc="040C0009">
+      <w:start w:val="1"/>
+      <w:numFmt w:val="bullet"/>
+      <w:lvlText w:val=""/>
+      <w:lvlJc w:val="left"/>
+      <w:pPr>
+        <w:ind w:left="1440" w:hanging="360"/>
+      </w:pPr>
+      <w:rPr>
+        <w:rFonts w:ascii="Wingdings" w:hAnsi="Wingdings" w:hint="default"/>
+      </w:rPr>
+    </w:lvl>
+    <w:lvl w:ilvl="1" w:tplc="040C0003" w:tentative="1">
+      <w:start w:val="1"/>
+      <w:numFmt w:val="bullet"/>
+      <w:lvlText w:val="o"/>
+      <w:lvlJc w:val="left"/>
+      <w:pPr>
+        <w:ind w:left="2160" w:hanging="360"/>
+      </w:pPr>
+      <w:rPr>
+        <w:rFonts w:ascii="Courier New" w:hAnsi="Courier New" w:cs="Courier New" w:hint="default"/>
+      </w:rPr>
+    </w:lvl>
+    <w:lvl w:ilvl="2" w:tplc="040C0005" w:tentative="1">
+      <w:start w:val="1"/>
+      <w:numFmt w:val="bullet"/>
+      <w:lvlText w:val=""/>
+      <w:lvlJc w:val="left"/>
+      <w:pPr>
+        <w:ind w:left="2880" w:hanging="360"/>
+      </w:pPr>
+      <w:rPr>
+        <w:rFonts w:ascii="Wingdings" w:hAnsi="Wingdings" w:hint="default"/>
+      </w:rPr>
+    </w:lvl>
+    <w:lvl w:ilvl="3" w:tplc="040C0001" w:tentative="1">
+      <w:start w:val="1"/>
+      <w:numFmt w:val="bullet"/>
+      <w:lvlText w:val=""/>
+      <w:lvlJc w:val="left"/>
+      <w:pPr>
+        <w:ind w:left="3600" w:hanging="360"/>
+      </w:pPr>
+      <w:rPr>
+        <w:rFonts w:ascii="Symbol" w:hAnsi="Symbol" w:hint="default"/>
+      </w:rPr>
+    </w:lvl>
+    <w:lvl w:ilvl="4" w:tplc="040C0003" w:tentative="1">
+      <w:start w:val="1"/>
+      <w:numFmt w:val="bullet"/>
+      <w:lvlText w:val="o"/>
+      <w:lvlJc w:val="left"/>
+      <w:pPr>
+        <w:ind w:left="4320" w:hanging="360"/>
+      </w:pPr>
+      <w:rPr>
+        <w:rFonts w:ascii="Courier New" w:hAnsi="Courier New" w:cs="Courier New" w:hint="default"/>
+      </w:rPr>
+    </w:lvl>
+    <w:lvl w:ilvl="5" w:tplc="040C0005" w:tentative="1">
+      <w:start w:val="1"/>
+      <w:numFmt w:val="bullet"/>
+      <w:lvlText w:val=""/>
+      <w:lvlJc w:val="left"/>
+      <w:pPr>
+        <w:ind w:left="5040" w:hanging="360"/>
+      </w:pPr>
+      <w:rPr>
+        <w:rFonts w:ascii="Wingdings" w:hAnsi="Wingdings" w:hint="default"/>
+      </w:rPr>
+    </w:lvl>
+    <w:lvl w:ilvl="6" w:tplc="040C0001" w:tentative="1">
+      <w:start w:val="1"/>
+      <w:numFmt w:val="bullet"/>
+      <w:lvlText w:val=""/>
+      <w:lvlJc w:val="left"/>
+      <w:pPr>
+        <w:ind w:left="5760" w:hanging="360"/>
+      </w:pPr>
+      <w:rPr>
+        <w:rFonts w:ascii="Symbol" w:hAnsi="Symbol" w:hint="default"/>
+      </w:rPr>
+    </w:lvl>
+    <w:lvl w:ilvl="7" w:tplc="040C0003" w:tentative="1">
+      <w:start w:val="1"/>
+      <w:numFmt w:val="bullet"/>
+      <w:lvlText w:val="o"/>
+      <w:lvlJc w:val="left"/>
+      <w:pPr>
+        <w:ind w:left="6480" w:hanging="360"/>
+      </w:pPr>
+      <w:rPr>
+        <w:rFonts w:ascii="Courier New" w:hAnsi="Courier New" w:cs="Courier New" w:hint="default"/>
+      </w:rPr>
+    </w:lvl>
+    <w:lvl w:ilvl="8" w:tplc="040C0005" w:tentative="1">
+      <w:start w:val="1"/>
+      <w:numFmt w:val="bullet"/>
+      <w:lvlText w:val=""/>
+      <w:lvlJc w:val="left"/>
+      <w:pPr>
+        <w:ind w:left="7200" w:hanging="360"/>
+      </w:pPr>
+      <w:rPr>
+        <w:rFonts w:ascii="Wingdings" w:hAnsi="Wingdings" w:hint="default"/>
+      </w:rPr>
+    </w:lvl>
+  </w:abstractNum>
+  <w:abstractNum w:abstractNumId="1" w15:restartNumberingAfterBreak="0">
+    <w:nsid w:val="1B2172D0"/>
+    <w:multiLevelType w:val="hybridMultilevel"/>
+    <w:tmpl w:val="49CA1778"/>
+    <w:lvl w:ilvl="0" w:tplc="98A6BCEC">
+      <w:start w:val="1"/>
+      <w:numFmt w:val="decimal"/>
+      <w:lvlText w:val="%1."/>
+      <w:lvlJc w:val="left"/>
+      <w:pPr>
+        <w:ind w:left="1080" w:hanging="360"/>
+      </w:pPr>
+      <w:rPr>
+        <w:rFonts w:hint="default"/>
+      </w:rPr>
+    </w:lvl>
+    <w:lvl w:ilvl="1" w:tplc="040C0019" w:tentative="1">
+      <w:start w:val="1"/>
+      <w:numFmt w:val="lowerLetter"/>
+      <w:lvlText w:val="%2."/>
+      <w:lvlJc w:val="left"/>
+      <w:pPr>
+        <w:ind w:left="1800" w:hanging="360"/>
+      </w:pPr>
+    </w:lvl>
+    <w:lvl w:ilvl="2" w:tplc="040C001B" w:tentative="1">
+      <w:start w:val="1"/>
+      <w:numFmt w:val="lowerRoman"/>
+      <w:lvlText w:val="%3."/>
+      <w:lvlJc w:val="right"/>
+      <w:pPr>
+        <w:ind w:left="2520" w:hanging="180"/>
+      </w:pPr>
+    </w:lvl>
+    <w:lvl w:ilvl="3" w:tplc="040C000F" w:tentative="1">
+      <w:start w:val="1"/>
+      <w:numFmt w:val="decimal"/>
+      <w:lvlText w:val="%4."/>
+      <w:lvlJc w:val="left"/>
+      <w:pPr>
+        <w:ind w:left="3240" w:hanging="360"/>
+      </w:pPr>
+    </w:lvl>
+    <w:lvl w:ilvl="4" w:tplc="040C0019" w:tentative="1">
+      <w:start w:val="1"/>
+      <w:numFmt w:val="lowerLetter"/>
+      <w:lvlText w:val="%5."/>
+      <w:lvlJc w:val="left"/>
+      <w:pPr>
+        <w:ind w:left="3960" w:hanging="360"/>
+      </w:pPr>
+    </w:lvl>
+    <w:lvl w:ilvl="5" w:tplc="040C001B" w:tentative="1">
+      <w:start w:val="1"/>
+      <w:numFmt w:val="lowerRoman"/>
+      <w:lvlText w:val="%6."/>
+      <w:lvlJc w:val="right"/>
+      <w:pPr>
+        <w:ind w:left="4680" w:hanging="180"/>
+      </w:pPr>
+    </w:lvl>
+    <w:lvl w:ilvl="6" w:tplc="040C000F" w:tentative="1">
+      <w:start w:val="1"/>
+      <w:numFmt w:val="decimal"/>
+      <w:lvlText w:val="%7."/>
+      <w:lvlJc w:val="left"/>
+      <w:pPr>
+        <w:ind w:left="5400" w:hanging="360"/>
+      </w:pPr>
+    </w:lvl>
+    <w:lvl w:ilvl="7" w:tplc="040C0019" w:tentative="1">
+      <w:start w:val="1"/>
+      <w:numFmt w:val="lowerLetter"/>
+      <w:lvlText w:val="%8."/>
+      <w:lvlJc w:val="left"/>
+      <w:pPr>
+        <w:ind w:left="6120" w:hanging="360"/>
+      </w:pPr>
+    </w:lvl>
+    <w:lvl w:ilvl="8" w:tplc="040C001B" w:tentative="1">
+      <w:start w:val="1"/>
+      <w:numFmt w:val="lowerRoman"/>
+      <w:lvlText w:val="%9."/>
+      <w:lvlJc w:val="right"/>
+      <w:pPr>
+        <w:ind w:left="6840" w:hanging="180"/>
+      </w:pPr>
+    </w:lvl>
+  </w:abstractNum>
+  <w:abstractNum w:abstractNumId="2" w15:restartNumberingAfterBreak="0">
     <w:nsid w:val="4C0A6FDA"/>
     <w:multiLevelType w:val="hybridMultilevel"/>
     <w:tmpl w:val="289C611E"/>
@@ -2065,7 +1876,120 @@
       </w:rPr>
     </w:lvl>
   </w:abstractNum>
-  <w:abstractNum w:abstractNumId="1" w15:restartNumberingAfterBreak="0">
+  <w:abstractNum w:abstractNumId="3" w15:restartNumberingAfterBreak="0">
+    <w:nsid w:val="5FA62426"/>
+    <w:multiLevelType w:val="hybridMultilevel"/>
+    <w:tmpl w:val="F4C6F5FC"/>
+    <w:lvl w:ilvl="0" w:tplc="040C0001">
+      <w:start w:val="1"/>
+      <w:numFmt w:val="bullet"/>
+      <w:lvlText w:val=""/>
+      <w:lvlJc w:val="left"/>
+      <w:pPr>
+        <w:ind w:left="2160" w:hanging="360"/>
+      </w:pPr>
+      <w:rPr>
+        <w:rFonts w:ascii="Symbol" w:hAnsi="Symbol" w:hint="default"/>
+      </w:rPr>
+    </w:lvl>
+    <w:lvl w:ilvl="1" w:tplc="040C0003" w:tentative="1">
+      <w:start w:val="1"/>
+      <w:numFmt w:val="bullet"/>
+      <w:lvlText w:val="o"/>
+      <w:lvlJc w:val="left"/>
+      <w:pPr>
+        <w:ind w:left="2880" w:hanging="360"/>
+      </w:pPr>
+      <w:rPr>
+        <w:rFonts w:ascii="Courier New" w:hAnsi="Courier New" w:cs="Courier New" w:hint="default"/>
+      </w:rPr>
+    </w:lvl>
+    <w:lvl w:ilvl="2" w:tplc="040C0005" w:tentative="1">
+      <w:start w:val="1"/>
+      <w:numFmt w:val="bullet"/>
+      <w:lvlText w:val=""/>
+      <w:lvlJc w:val="left"/>
+      <w:pPr>
+        <w:ind w:left="3600" w:hanging="360"/>
+      </w:pPr>
+      <w:rPr>
+        <w:rFonts w:ascii="Wingdings" w:hAnsi="Wingdings" w:hint="default"/>
+      </w:rPr>
+    </w:lvl>
+    <w:lvl w:ilvl="3" w:tplc="040C0001" w:tentative="1">
+      <w:start w:val="1"/>
+      <w:numFmt w:val="bullet"/>
+      <w:lvlText w:val=""/>
+      <w:lvlJc w:val="left"/>
+      <w:pPr>
+        <w:ind w:left="4320" w:hanging="360"/>
+      </w:pPr>
+      <w:rPr>
+        <w:rFonts w:ascii="Symbol" w:hAnsi="Symbol" w:hint="default"/>
+      </w:rPr>
+    </w:lvl>
+    <w:lvl w:ilvl="4" w:tplc="040C0003" w:tentative="1">
+      <w:start w:val="1"/>
+      <w:numFmt w:val="bullet"/>
+      <w:lvlText w:val="o"/>
+      <w:lvlJc w:val="left"/>
+      <w:pPr>
+        <w:ind w:left="5040" w:hanging="360"/>
+      </w:pPr>
+      <w:rPr>
+        <w:rFonts w:ascii="Courier New" w:hAnsi="Courier New" w:cs="Courier New" w:hint="default"/>
+      </w:rPr>
+    </w:lvl>
+    <w:lvl w:ilvl="5" w:tplc="040C0005" w:tentative="1">
+      <w:start w:val="1"/>
+      <w:numFmt w:val="bullet"/>
+      <w:lvlText w:val=""/>
+      <w:lvlJc w:val="left"/>
+      <w:pPr>
+        <w:ind w:left="5760" w:hanging="360"/>
+      </w:pPr>
+      <w:rPr>
+        <w:rFonts w:ascii="Wingdings" w:hAnsi="Wingdings" w:hint="default"/>
+      </w:rPr>
+    </w:lvl>
+    <w:lvl w:ilvl="6" w:tplc="040C0001" w:tentative="1">
+      <w:start w:val="1"/>
+      <w:numFmt w:val="bullet"/>
+      <w:lvlText w:val=""/>
+      <w:lvlJc w:val="left"/>
+      <w:pPr>
+        <w:ind w:left="6480" w:hanging="360"/>
+      </w:pPr>
+      <w:rPr>
+        <w:rFonts w:ascii="Symbol" w:hAnsi="Symbol" w:hint="default"/>
+      </w:rPr>
+    </w:lvl>
+    <w:lvl w:ilvl="7" w:tplc="040C0003" w:tentative="1">
+      <w:start w:val="1"/>
+      <w:numFmt w:val="bullet"/>
+      <w:lvlText w:val="o"/>
+      <w:lvlJc w:val="left"/>
+      <w:pPr>
+        <w:ind w:left="7200" w:hanging="360"/>
+      </w:pPr>
+      <w:rPr>
+        <w:rFonts w:ascii="Courier New" w:hAnsi="Courier New" w:cs="Courier New" w:hint="default"/>
+      </w:rPr>
+    </w:lvl>
+    <w:lvl w:ilvl="8" w:tplc="040C0005" w:tentative="1">
+      <w:start w:val="1"/>
+      <w:numFmt w:val="bullet"/>
+      <w:lvlText w:val=""/>
+      <w:lvlJc w:val="left"/>
+      <w:pPr>
+        <w:ind w:left="7920" w:hanging="360"/>
+      </w:pPr>
+      <w:rPr>
+        <w:rFonts w:ascii="Wingdings" w:hAnsi="Wingdings" w:hint="default"/>
+      </w:rPr>
+    </w:lvl>
+  </w:abstractNum>
+  <w:abstractNum w:abstractNumId="4" w15:restartNumberingAfterBreak="0">
     <w:nsid w:val="65D14FD5"/>
     <w:multiLevelType w:val="hybridMultilevel"/>
     <w:tmpl w:val="B10A5D6A"/>
@@ -2156,10 +2080,19 @@
     </w:lvl>
   </w:abstractNum>
   <w:num w:numId="1" w16cid:durableId="1127429232">
+    <w:abstractNumId w:val="4"/>
+  </w:num>
+  <w:num w:numId="2" w16cid:durableId="1220243198">
+    <w:abstractNumId w:val="2"/>
+  </w:num>
+  <w:num w:numId="3" w16cid:durableId="1061637223">
     <w:abstractNumId w:val="1"/>
   </w:num>
-  <w:num w:numId="2" w16cid:durableId="1220243198">
+  <w:num w:numId="4" w16cid:durableId="281767032">
     <w:abstractNumId w:val="0"/>
+  </w:num>
+  <w:num w:numId="5" w16cid:durableId="963583189">
+    <w:abstractNumId w:val="3"/>
   </w:num>
 </w:numbering>
 </file>
@@ -3132,6 +3065,18 @@
       <w:shd w:val="clear" w:color="auto" w:fill="E1DFDD"/>
     </w:rPr>
   </w:style>
+  <w:style w:type="character" w:styleId="FollowedHyperlink">
+    <w:name w:val="FollowedHyperlink"/>
+    <w:basedOn w:val="DefaultParagraphFont"/>
+    <w:uiPriority w:val="99"/>
+    <w:semiHidden/>
+    <w:unhideWhenUsed/>
+    <w:rsid w:val="009C66F4"/>
+    <w:rPr>
+      <w:color w:val="96607D" w:themeColor="followedHyperlink"/>
+      <w:u w:val="single"/>
+    </w:rPr>
+  </w:style>
 </w:styles>
 </file>
 

</xml_diff>